<commit_message>
Add hospital bed supply analysis by province, 2004-2024
INEC bed series by province, fixed-effects models of ACSC and non-ACSC
hospitalizations, between-province association, Figure S8 and Table S9.

Co-Authored-By: Claude Opus 5.5 <noreply@anthropic.com>
Claude-Session: https://claude.ai/code/session_01LYcgLwfYY3ciwuyYYwZuXL
</commit_message>
<xml_diff>
--- a/supplementary/Supplementary_material.docx
+++ b/supplementary/Supplementary_material.docx
@@ -40,7 +40,7 @@
           <w:sz w:val="20"/>
           <w:szCs w:val="20"/>
         </w:rPr>
-        <w:t xml:space="preserve">Tables S4–S8 are provided as spreadsheet files: S4 joinpoint regression of all series; S5 segmented regression by ACSC group; S6 sensitivity analyses; S7 annual provincial age-standardized rates with 95% confidence intervals for 2000–2024; S8 annual indicators of geographic variation.</w:t>
+        <w:t xml:space="preserve">Tables S4–S9 are provided as spreadsheet files: S4 joinpoint regression of all series; S5 segmented regression by ACSC group; S6 sensitivity analyses; S7 annual provincial age-standardized rates with 95% confidence intervals for 2000–2024; S8 annual indicators of geographic variation; S9 hospital bed supply by province and its association with hospitalizations, 2004–2024.</w:t>
       </w:r>
     </w:p>
     <w:p>
@@ -22145,6 +22145,75 @@
         <w:t xml:space="preserve"> Local Moran's I clusters at p &lt; 0.05, queen contiguity.</w:t>
       </w:r>
     </w:p>
+    <w:p>
+      <w:pPr>
+        <w:pageBreakBefore/>
+        <w:jc w:val="center"/>
+      </w:pPr>
+      <w:r>
+        <w:drawing>
+          <wp:inline distT="0" distB="0" distL="0" distR="0">
+            <wp:extent cx="8572500" cy="5486400"/>
+            <wp:effectExtent t="0" r="0" b="0" l="0"/>
+            <wp:docPr id="1" name="" descr="" title=""/>
+            <wp:cNvGraphicFramePr>
+              <a:graphicFrameLocks xmlns:a="http://schemas.openxmlformats.org/drawingml/2006/main" noChangeAspect="1"/>
+            </wp:cNvGraphicFramePr>
+            <a:graphic xmlns:a="http://schemas.openxmlformats.org/drawingml/2006/main">
+              <a:graphicData uri="http://schemas.openxmlformats.org/drawingml/2006/picture">
+                <pic:pic xmlns:pic="http://schemas.openxmlformats.org/drawingml/2006/picture">
+                  <pic:nvPicPr>
+                    <pic:cNvPr id="0" name="" descr=""/>
+                    <pic:cNvPicPr>
+                      <a:picLocks noChangeAspect="1" noChangeArrowheads="1"/>
+                    </pic:cNvPicPr>
+                  </pic:nvPicPr>
+                  <pic:blipFill>
+                    <a:blip r:embed="rId14" cstate="none"/>
+                    <a:srcRect/>
+                    <a:stretch>
+                      <a:fillRect/>
+                    </a:stretch>
+                  </pic:blipFill>
+                  <pic:spPr bwMode="auto">
+                    <a:xfrm>
+                      <a:off x="0" y="0"/>
+                      <a:ext cx="8572500" cy="5486400"/>
+                    </a:xfrm>
+                    <a:prstGeom prst="rect">
+                      <a:avLst/>
+                    </a:prstGeom>
+                  </pic:spPr>
+                </pic:pic>
+              </a:graphicData>
+            </a:graphic>
+          </wp:inline>
+        </w:drawing>
+      </w:r>
+    </w:p>
+    <w:p>
+      <w:pPr>
+        <w:spacing w:before="120"/>
+      </w:pPr>
+      <w:r>
+        <w:rPr>
+          <w:rFonts w:ascii="Arial" w:cs="Arial" w:eastAsia="Arial" w:hAnsi="Arial"/>
+          <w:b/>
+          <w:bCs/>
+          <w:sz w:val="20"/>
+          <w:szCs w:val="20"/>
+        </w:rPr>
+        <w:t xml:space="preserve">Figure S8. Hospital bed supply by province and ACSC hospitalization rates, Ecuador, 2004–2024.</w:t>
+      </w:r>
+      <w:r>
+        <w:rPr>
+          <w:rFonts w:ascii="Arial" w:cs="Arial" w:eastAsia="Arial" w:hAnsi="Arial"/>
+          <w:sz w:val="20"/>
+          <w:szCs w:val="20"/>
+        </w:rPr>
+        <w:t xml:space="preserve"> A: available hospital beds per 10,000 population by province of the establishment in 2004 and 2024 (five-year running median). B: age-standardized ACSC rates per 100,000 by province of residence against beds per 10,000 population, by period; lines are least-squares fits.</w:t>
+      </w:r>
+    </w:p>
     <w:sectPr>
       <w:pgSz w:w="16838" w:h="11906" w:orient="landscape"/>
       <w:pgMar w:top="1000" w:right="1000" w:bottom="1000" w:left="1000" w:header="708" w:footer="708" w:gutter="0"/>

</xml_diff>

<commit_message>
Extend bed analysis to 2000-2024 with INEC establishment files 2000-2003
Co-Authored-By: Claude Opus 5.5 <noreply@anthropic.com>
Claude-Session: https://claude.ai/code/session_01LYcgLwfYY3ciwuyYYwZuXL
</commit_message>
<xml_diff>
--- a/supplementary/Supplementary_material.docx
+++ b/supplementary/Supplementary_material.docx
@@ -40,7 +40,7 @@
           <w:sz w:val="20"/>
           <w:szCs w:val="20"/>
         </w:rPr>
-        <w:t xml:space="preserve">Tables S4–S9 are provided as spreadsheet files: S4 joinpoint regression of all series; S5 segmented regression by ACSC group; S6 sensitivity analyses; S7 annual provincial age-standardized rates with 95% confidence intervals for 2000–2024; S8 annual indicators of geographic variation; S9 hospital bed supply by province and its association with hospitalizations, 2004–2024.</w:t>
+        <w:t xml:space="preserve">Tables S4–S9 are provided as spreadsheet files: S4 joinpoint regression of all series; S5 segmented regression by ACSC group; S6 sensitivity analyses; S7 annual provincial age-standardized rates with 95% confidence intervals for 2000–2024; S8 annual indicators of geographic variation; S9 hospital bed supply by province and its association with hospitalizations, 2000–2024.</w:t>
       </w:r>
     </w:p>
     <w:p>
@@ -22203,7 +22203,7 @@
           <w:sz w:val="20"/>
           <w:szCs w:val="20"/>
         </w:rPr>
-        <w:t xml:space="preserve">Figure S8. Hospital bed supply by province and ACSC hospitalization rates, Ecuador, 2004–2024.</w:t>
+        <w:t xml:space="preserve">Figure S8. Hospital bed supply by province and ACSC hospitalization rates, Ecuador, 2000–2024.</w:t>
       </w:r>
       <w:r>
         <w:rPr>
@@ -22211,7 +22211,7 @@
           <w:sz w:val="20"/>
           <w:szCs w:val="20"/>
         </w:rPr>
-        <w:t xml:space="preserve"> A: available hospital beds per 10,000 population by province of the establishment in 2004 and 2024 (five-year running median). B: age-standardized ACSC rates per 100,000 by province of residence against beds per 10,000 population, by period; lines are least-squares fits.</w:t>
+        <w:t xml:space="preserve"> A: available hospital beds per 10,000 population by province of the establishment in 2000 and 2024 (repeated five-year running median). B: age-standardized ACSC rates per 100,000 by province of residence against beds per 10,000 population, by period; lines are least-squares fits.</w:t>
       </w:r>
     </w:p>
     <w:sectPr>

</xml_diff>